<commit_message>
Design brief: public effect sizes as human benchmark, no new human experiment
Co-Authored-By: Claude Sonnet 5.5 <noreply@anthropic.com>
Claude-Session: https://claude.ai/code/session_01BZjJPdbxvnVxMrcgFoYMCh
</commit_message>
<xml_diff>
--- a/ideas/Digital_Twin_BehavioralEcon_Design.docx
+++ b/ideas/Digital_Twin_BehavioralEcon_Design.docx
@@ -45,7 +45,7 @@
     </w:p>
     <w:p>
       <w:r>
-        <w:t>RQ1 트윈은 이론 효과의 방향과 크기를 재현하는가?  RQ2 조절변수 상호작용(조건 의존성)까지 재현하는가?  RQ3 고전 문항과 구조가 같은 새 문항에서 효과가 줄어드는가(오염)?  RQ4 플랫폼 맥락(기본값, 가격 표시, 다크 패턴)에서 트윈이 예측한 효과가 실제 사람의 효과와 일치하는가?</w:t>
+        <w:t>RQ1 트윈은 이론 효과의 방향과 크기를 재현하는가?  RQ2 조절변수 상호작용(조건 의존성)까지 재현하는가?  RQ3 고전 문항과 구조가 같은 새 문항에서 효과가 줄어드는가(오염)?  RQ4 플랫폼 맥락(기본값, 가격 표시, 다크 패턴)에서 트윈이 예측한 효과크기가, 이미 출판된 현장 실험·메타분석의 효과크기 범위 안에 드는가?</w:t>
       </w:r>
     </w:p>
     <w:p>
@@ -107,7 +107,7 @@
         <w:t xml:space="preserve">사람 기준. </w:t>
       </w:r>
       <w:r>
-        <w:t>공개 데이터(Twin-2K-500, Many Labs 계열과 사전등록 복제 데이터)를 우선 사용. 새 실험(Prolific 등, IRB 필요)은 플랫폼 문항 ④ 한정 소규모로 선택.</w:t>
+        <w:t>새 사람 실험은 하지 않는다. 사람 기준은 전부 공개 자료: (i) 실험 문항 단위 비교는 Twin-2K-500과 Many Labs/사전등록 복제 데이터, (ii) 플랫폼 문항(④)은 출판된 현장 실험과 메타분석의 풀링 효과크기와 신뢰구간(예: 기본값 효과의 메타분석)을 기준으로 삼아, 트윈의 효과크기가 그 구간에 드는지, 효과 순서가 맞는지를 본다. 문항은 메타분석이 다룬 조건(옵트인/옵트아웃, 기본 선택지의 유형 등)에 맞추어 설계한다.</w:t>
       </w:r>
     </w:p>
     <w:p>
@@ -135,7 +135,7 @@
     </w:p>
     <w:p>
       <w:r>
-        <w:t>H1 트윈은 고전 효과의 방향을 대부분(80% 이상) 재현하지만 크기는 사람보다 크다(과대 재현).  H2 변형 문항에서는 효과가 고전 문항보다 작다(오염 지표 &lt; 1).  H3 조절변수 상호작용의 재현율은 주효과보다 낮다.  H4 개인 응답 정보를 더 주면 평균 효과는 개선되나 이질성 재현은 거의 개선되지 않는다.  H5 플랫폼 문항에서 트윈이 예측한 효과 순서(어떤 설계가 더 큰 효과를 내는가)는 사람의 순서와 양의 상관을 보이되, 크기는 체계적으로 편향된다.  성공/실패 기준(부호, 상관 하한)은 데이터를 보기 전에 고정한다.</w:t>
+        <w:t>H1 트윈은 고전 효과의 방향을 대부분(80% 이상) 재현하지만 크기는 사람보다 크다(과대 재현).  H2 변형 문항에서는 효과가 고전 문항보다 작다(오염 지표 &lt; 1).  H3 조절변수 상호작용의 재현율은 주효과보다 낮다.  H4 개인 응답 정보를 더 주면 평균 효과는 개선되나 이질성 재현은 거의 개선되지 않는다.  H5 플랫폼 문항에서 트윈의 효과 순서(어떤 설계가 더 큰 효과를 내는가)는 메타분석의 조건별 효과 순서와 양의 상관을 보이되, 크기는 메타분석 구간 밖으로 체계적으로 벗어난다(과대).  성공/실패 기준(부호, 상관 하한)은 데이터를 보기 전에 고정한다.</w:t>
       </w:r>
     </w:p>
     <w:p>
@@ -169,7 +169,7 @@
     </w:p>
     <w:p>
       <w:r>
-        <w:t>공개 데이터만 사용 시 API 비용 대략 수백 달러, 4~6주. 새 사람 실험을 더하면 수천 달러와 IRB 수 주 추가(추정치). 위험: 모델 변화로 결과가 빨리 낡음, 오염 통제의 불완전성, 선점 경쟁, 사람 실험의 재현성.</w:t>
+        <w:t>공개 자료만 사용: API 비용 대략 수백 달러, 4~6주, IRB 불필요(추정치). 위험 추가: 메타분석 효과크기는 문항 조건이 달라 직접 비교가 어려울 수 있어, 비교 가능한 조건만 골라 사전 등록한다. 위험: 모델 변화로 결과가 빨리 낡음, 오염 통제의 불완전성, 선점 경쟁, 사람 실험의 재현성.</w:t>
       </w:r>
     </w:p>
     <w:sectPr>

</xml_diff>

<commit_message>
Design brief: add RQ5/H6 on training stage, resource limits, bias and confabulation
Co-Authored-By: Claude Opus 5.5 <noreply@anthropic.com>
Claude-Session: https://claude.ai/code/session_01BZjJPdbxvnVxMrcgFoYMCh
</commit_message>
<xml_diff>
--- a/ideas/Digital_Twin_BehavioralEcon_Design.docx
+++ b/ideas/Digital_Twin_BehavioralEcon_Design.docx
@@ -45,7 +45,7 @@
     </w:p>
     <w:p>
       <w:r>
-        <w:t>RQ1 트윈은 이론 효과의 방향과 크기를 재현하는가?  RQ2 조절변수 상호작용(조건 의존성)까지 재현하는가?  RQ3 고전 문항과 구조가 같은 새 문항에서 효과가 줄어드는가(오염)?  RQ4 플랫폼 맥락(기본값, 가격 표시, 다크 패턴)에서 트윈이 예측한 효과크기가, 이미 출판된 현장 실험·메타분석의 효과크기 범위 안에 드는가?</w:t>
+        <w:t>RQ1 트윈은 이론 효과의 방향과 크기를 재현하는가?  RQ2 조절변수 상호작용(조건 의존성)까지 재현하는가?  RQ3 고전 문항과 구조가 같은 새 문항에서 효과가 줄어드는가(오염)?  RQ4 플랫폼 맥락(기본값, 가격 표시, 다크 패턴)에서 트윈이 예측한 효과크기가, 이미 출판된 현장 실험·메타분석의 효과크기 범위 안에 드는가?  RQ5 편향의 크기는 모델의 학습 단계(기본 사전학습 → 지시 학습 → 추론 모델)와 자원 제약(생각 예산, 컨텍스트 길이, 샘플링 온도)에 따라 어떻게 달라지며, 같은 조작에서 환각(작화)과 같은 방향으로 움직이는가?</w:t>
       </w:r>
     </w:p>
     <w:p>
@@ -86,6 +86,17 @@
       </w:r>
       <w:r>
         <w:t>(a) 트윈: 인구통계 페르소나만  vs  개인 응답 기반 트윈(Twin-2K-500 형식)  vs  이론 명시 프롬프트(누설 검사). 모델 4~5종(최신), 문항당 반복 응답으로 분포를 얻는다.</w:t>
+      </w:r>
+    </w:p>
+    <w:p>
+      <w:r>
+        <w:rPr>
+          <w:b/>
+        </w:rPr>
+        <w:t xml:space="preserve">RQ5 조작. </w:t>
+      </w:r>
+      <w:r>
+        <w:t>공개된 기본 모델과 지시 모델의 쌍(같은 계열)으로 학습 단계를 비교하고, 같은 모델 안에서 생각 예산·컨텍스트·온도를 바꾼다. 각 조건에서 편향 효과크기와, 사실 질문 세트에서의 환각률을 함께 측정한다. 새 모델을 처음부터 학습하는 것은 비용 때문에 제외.</w:t>
       </w:r>
     </w:p>
     <w:p>
@@ -135,7 +146,7 @@
     </w:p>
     <w:p>
       <w:r>
-        <w:t>H1 트윈은 고전 효과의 방향을 대부분(80% 이상) 재현하지만 크기는 사람보다 크다(과대 재현).  H2 변형 문항에서는 효과가 고전 문항보다 작다(오염 지표 &lt; 1).  H3 조절변수 상호작용의 재현율은 주효과보다 낮다.  H4 개인 응답 정보를 더 주면 평균 효과는 개선되나 이질성 재현은 거의 개선되지 않는다.  H5 플랫폼 문항에서 트윈의 효과 순서(어떤 설계가 더 큰 효과를 내는가)는 메타분석의 조건별 효과 순서와 양의 상관을 보이되, 크기는 메타분석 구간 밖으로 체계적으로 벗어난다(과대).  성공/실패 기준(부호, 상관 하한)은 데이터를 보기 전에 고정한다.</w:t>
+        <w:t>H1 트윈은 고전 효과의 방향을 대부분(80% 이상) 재현하지만 크기는 사람보다 크다(과대 재현).  H2 변형 문항에서는 효과가 고전 문항보다 작다(오염 지표 &lt; 1).  H3 조절변수 상호작용의 재현율은 주효과보다 낮다.  H4 개인 응답 정보를 더 주면 평균 효과는 개선되나 이질성 재현은 거의 개선되지 않는다.  H5 플랫폼 문항에서 트윈의 효과 순서(어떤 설계가 더 큰 효과를 내는가)는 메타분석의 조건별 효과 순서와 양의 상관을 보이되, 크기는 메타분석 구간 밖으로 체계적으로 벗어난다(과대).  H6 지시 학습과 추론 단계에서 편향은 줄지만 0이 되지 않으며, 자원 제약을 강하게 할수록(생각 예산 축소, 온도 상승) 편향과 환각이 함께 커진다. 이는 두 현상이 제한된 자원 하의 예측 근사라는 공유된 계산 원리(자원 합리성, 예측 부호화)에서 나온다는 가설과 일치하며, 인간 뇌의 기제를 직접 입증하는 것은 아니다(기능적 유사성 ≠ 같은 기제; 학습 데이터를 통한 편향 상속 가능성은 기본 모델 비교로 일부만 분리).  성공/실패 기준(부호, 상관 하한)은 데이터를 보기 전에 고정한다.</w:t>
       </w:r>
     </w:p>
     <w:p>

</xml_diff>